<commit_message>
Correccion masiva de errores
- Se quitan comentarios innecesarios
- Se Agrega el favicon de la pagina
- Se corrige el error de visualización del logo de la veeduria
- Se arregla el problema de reordenar hechos y pretenciones en moviles.
- Se agregan los datos del gestor catastral de mosquera para la solicitud de revision
</commit_message>
<xml_diff>
--- a/src/docs/Solicitud_Revision.docx
+++ b/src/docs/Solicitud_Revision.docx
@@ -33,7 +33,6 @@
     <w:p>
       <w:pPr>
         <w:spacing w:after="0"/>
-        <w:jc w:val="both"/>
         <w:rPr>
           <w:rFonts w:ascii="Arial" w:hAnsi="Arial" w:cs="Arial"/>
           <w:color w:val="0F9ED5" w:themeColor="accent4"/>
@@ -56,7 +55,16 @@
           <w:szCs w:val="24"/>
         </w:rPr>
         <w:br/>
-        <w:t>[Entidad]</w:t>
+      </w:r>
+      <w:r>
+        <w:rPr>
+          <w:rFonts w:ascii="Arial" w:hAnsi="Arial" w:cs="Arial"/>
+          <w:b/>
+          <w:bCs/>
+          <w:sz w:val="24"/>
+          <w:szCs w:val="24"/>
+        </w:rPr>
+        <w:t>Instituto Geográfico Agustin Codazzi</w:t>
       </w:r>
       <w:r>
         <w:rPr>
@@ -65,25 +73,15 @@
           <w:szCs w:val="24"/>
         </w:rPr>
         <w:br/>
-        <w:t>[</w:t>
-      </w:r>
-      <w:proofErr w:type="spellStart"/>
-      <w:r>
-        <w:rPr>
-          <w:rFonts w:ascii="Arial" w:hAnsi="Arial" w:cs="Arial"/>
-          <w:sz w:val="24"/>
-          <w:szCs w:val="24"/>
-        </w:rPr>
-        <w:t>Correo_Entidad</w:t>
-      </w:r>
-      <w:proofErr w:type="spellEnd"/>
-      <w:r>
-        <w:rPr>
-          <w:rFonts w:ascii="Arial" w:hAnsi="Arial" w:cs="Arial"/>
-          <w:sz w:val="24"/>
-          <w:szCs w:val="24"/>
-        </w:rPr>
-        <w:t>]</w:t>
+      </w:r>
+      <w:r>
+        <w:rPr>
+          <w:rFonts w:ascii="Arial" w:hAnsi="Arial" w:cs="Arial"/>
+          <w:color w:val="0F9ED5" w:themeColor="accent4"/>
+          <w:sz w:val="24"/>
+          <w:szCs w:val="24"/>
+        </w:rPr>
+        <w:t>contactenos@igac.gov.co</w:t>
       </w:r>
     </w:p>
     <w:p>
@@ -2151,6 +2149,29 @@
       <w:spacing w:val="5"/>
     </w:rPr>
   </w:style>
+  <w:style w:type="character" w:styleId="Hipervnculo">
+    <w:name w:val="Hyperlink"/>
+    <w:basedOn w:val="Fuentedeprrafopredeter"/>
+    <w:uiPriority w:val="99"/>
+    <w:unhideWhenUsed/>
+    <w:rsid w:val="009C64FB"/>
+    <w:rPr>
+      <w:color w:val="467886" w:themeColor="hyperlink"/>
+      <w:u w:val="single"/>
+    </w:rPr>
+  </w:style>
+  <w:style w:type="character" w:styleId="Mencinsinresolver">
+    <w:name w:val="Unresolved Mention"/>
+    <w:basedOn w:val="Fuentedeprrafopredeter"/>
+    <w:uiPriority w:val="99"/>
+    <w:semiHidden/>
+    <w:unhideWhenUsed/>
+    <w:rsid w:val="009C64FB"/>
+    <w:rPr>
+      <w:color w:val="605E5C"/>
+      <w:shd w:val="clear" w:color="auto" w:fill="E1DFDD"/>
+    </w:rPr>
+  </w:style>
 </w:styles>
 </file>
 

</xml_diff>

<commit_message>
Refactorizacion del proyecto - Se crea el componente Wizard para manejar formularios futuros - Se crea la logica de rutas para iniciar el desarrollo del form "Recurso de reconsideración" - Se componetiza la construccion del formulario "Solcitud de revision" - Se corrige un error en la generacion de documentos que ponia hechos y peticiones sin saltos de linea
</commit_message>
<xml_diff>
--- a/src/docs/Solicitud_Revision.docx
+++ b/src/docs/Solicitud_Revision.docx
@@ -215,97 +215,10 @@
           <w:sz w:val="24"/>
           <w:szCs w:val="24"/>
         </w:rPr>
-        <w:t>Nombre_Solicitante</w:t>
-      </w:r>
-      <w:proofErr w:type="spellEnd"/>
-      <w:r>
-        <w:rPr>
-          <w:rFonts w:ascii="Arial" w:hAnsi="Arial" w:cs="Arial"/>
-          <w:sz w:val="24"/>
-          <w:szCs w:val="24"/>
-        </w:rPr>
-        <w:t xml:space="preserve"> </w:t>
-      </w:r>
-      <w:r>
-        <w:rPr>
-          <w:rFonts w:ascii="Arial" w:hAnsi="Arial" w:cs="Arial"/>
-          <w:sz w:val="24"/>
-          <w:szCs w:val="24"/>
-        </w:rPr>
-        <w:t>,</w:t>
-      </w:r>
-      <w:r>
-        <w:rPr>
-          <w:rFonts w:ascii="Arial" w:hAnsi="Arial" w:cs="Arial"/>
-          <w:sz w:val="24"/>
-          <w:szCs w:val="24"/>
-        </w:rPr>
-        <w:t xml:space="preserve">mayor de edad, </w:t>
-      </w:r>
-      <w:proofErr w:type="spellStart"/>
-      <w:r>
-        <w:rPr>
-          <w:rFonts w:ascii="Arial" w:hAnsi="Arial" w:cs="Arial"/>
-          <w:sz w:val="24"/>
-          <w:szCs w:val="24"/>
-        </w:rPr>
-        <w:t>identificad</w:t>
-      </w:r>
-      <w:r>
-        <w:rPr>
-          <w:rFonts w:ascii="Arial" w:hAnsi="Arial" w:cs="Arial"/>
-          <w:sz w:val="24"/>
-          <w:szCs w:val="24"/>
-        </w:rPr>
-        <w:t>Genero_Verbo</w:t>
-      </w:r>
-      <w:proofErr w:type="spellEnd"/>
-      <w:r>
-        <w:rPr>
-          <w:rFonts w:ascii="Arial" w:hAnsi="Arial" w:cs="Arial"/>
-          <w:sz w:val="24"/>
-          <w:szCs w:val="24"/>
-        </w:rPr>
-        <w:t xml:space="preserve"> </w:t>
-      </w:r>
-      <w:r>
-        <w:rPr>
-          <w:rFonts w:ascii="Arial" w:hAnsi="Arial" w:cs="Arial"/>
-          <w:sz w:val="24"/>
-          <w:szCs w:val="24"/>
-        </w:rPr>
-        <w:t>con la cédula de ciudadanía</w:t>
-      </w:r>
-      <w:r>
-        <w:rPr>
-          <w:rFonts w:ascii="Arial" w:hAnsi="Arial" w:cs="Arial"/>
-          <w:sz w:val="24"/>
-          <w:szCs w:val="24"/>
-        </w:rPr>
-        <w:t xml:space="preserve"> </w:t>
-      </w:r>
-      <w:proofErr w:type="spellStart"/>
-      <w:r>
-        <w:rPr>
-          <w:rFonts w:ascii="Arial" w:hAnsi="Arial" w:cs="Arial"/>
-          <w:sz w:val="24"/>
-          <w:szCs w:val="24"/>
-        </w:rPr>
-        <w:t>Cedula_Solicitante</w:t>
-      </w:r>
-      <w:proofErr w:type="spellEnd"/>
-      <w:r>
-        <w:rPr>
-          <w:rFonts w:ascii="Arial" w:hAnsi="Arial" w:cs="Arial"/>
-          <w:sz w:val="24"/>
-          <w:szCs w:val="24"/>
-        </w:rPr>
-        <w:t xml:space="preserve">, actuando con plena capacidad legal, me dirijo de la manera más respetuosa en el ejercicio del derecho consagrado en el Artículo 23 superior y desarrollado por la Ley 1755 de 2015, para presentar DERECHO DE PETICIÓN, con el ánimo de que me sean atendidas las siguientes </w:t>
-      </w:r>
-    </w:p>
-    <w:p>
-      <w:pPr>
-        <w:jc w:val="center"/>
+        <w:t>Nombre_</w:t>
+      </w:r>
+      <w:proofErr w:type="gramStart"/>
+      <w:r>
         <w:rPr>
           <w:rFonts w:ascii="Arial" w:hAnsi="Arial" w:cs="Arial"/>
           <w:b/>
@@ -313,7 +226,102 @@
           <w:sz w:val="24"/>
           <w:szCs w:val="24"/>
         </w:rPr>
-      </w:pPr>
+        <w:t>Solicitante</w:t>
+      </w:r>
+      <w:proofErr w:type="spellEnd"/>
+      <w:r>
+        <w:rPr>
+          <w:rFonts w:ascii="Arial" w:hAnsi="Arial" w:cs="Arial"/>
+          <w:sz w:val="24"/>
+          <w:szCs w:val="24"/>
+        </w:rPr>
+        <w:t xml:space="preserve"> </w:t>
+      </w:r>
+      <w:r>
+        <w:rPr>
+          <w:rFonts w:ascii="Arial" w:hAnsi="Arial" w:cs="Arial"/>
+          <w:sz w:val="24"/>
+          <w:szCs w:val="24"/>
+        </w:rPr>
+        <w:t>,</w:t>
+      </w:r>
+      <w:r>
+        <w:rPr>
+          <w:rFonts w:ascii="Arial" w:hAnsi="Arial" w:cs="Arial"/>
+          <w:sz w:val="24"/>
+          <w:szCs w:val="24"/>
+        </w:rPr>
+        <w:t>mayor</w:t>
+      </w:r>
+      <w:proofErr w:type="gramEnd"/>
+      <w:r>
+        <w:rPr>
+          <w:rFonts w:ascii="Arial" w:hAnsi="Arial" w:cs="Arial"/>
+          <w:sz w:val="24"/>
+          <w:szCs w:val="24"/>
+        </w:rPr>
+        <w:t xml:space="preserve"> de edad, </w:t>
+      </w:r>
+      <w:proofErr w:type="spellStart"/>
+      <w:r>
+        <w:rPr>
+          <w:rFonts w:ascii="Arial" w:hAnsi="Arial" w:cs="Arial"/>
+          <w:sz w:val="24"/>
+          <w:szCs w:val="24"/>
+        </w:rPr>
+        <w:t>identificad</w:t>
+      </w:r>
+      <w:r>
+        <w:rPr>
+          <w:rFonts w:ascii="Arial" w:hAnsi="Arial" w:cs="Arial"/>
+          <w:sz w:val="24"/>
+          <w:szCs w:val="24"/>
+        </w:rPr>
+        <w:t>Genero_Verbo</w:t>
+      </w:r>
+      <w:proofErr w:type="spellEnd"/>
+      <w:r>
+        <w:rPr>
+          <w:rFonts w:ascii="Arial" w:hAnsi="Arial" w:cs="Arial"/>
+          <w:sz w:val="24"/>
+          <w:szCs w:val="24"/>
+        </w:rPr>
+        <w:t xml:space="preserve"> </w:t>
+      </w:r>
+      <w:r>
+        <w:rPr>
+          <w:rFonts w:ascii="Arial" w:hAnsi="Arial" w:cs="Arial"/>
+          <w:sz w:val="24"/>
+          <w:szCs w:val="24"/>
+        </w:rPr>
+        <w:t>con la cédula de ciudadanía</w:t>
+      </w:r>
+      <w:r>
+        <w:rPr>
+          <w:rFonts w:ascii="Arial" w:hAnsi="Arial" w:cs="Arial"/>
+          <w:sz w:val="24"/>
+          <w:szCs w:val="24"/>
+        </w:rPr>
+        <w:t xml:space="preserve"> </w:t>
+      </w:r>
+      <w:proofErr w:type="spellStart"/>
+      <w:r>
+        <w:rPr>
+          <w:rFonts w:ascii="Arial" w:hAnsi="Arial" w:cs="Arial"/>
+          <w:sz w:val="24"/>
+          <w:szCs w:val="24"/>
+        </w:rPr>
+        <w:t>Cedula_Solicitante</w:t>
+      </w:r>
+      <w:proofErr w:type="spellEnd"/>
+      <w:r>
+        <w:rPr>
+          <w:rFonts w:ascii="Arial" w:hAnsi="Arial" w:cs="Arial"/>
+          <w:sz w:val="24"/>
+          <w:szCs w:val="24"/>
+        </w:rPr>
+        <w:t xml:space="preserve">, actuando con plena capacidad legal, me dirijo de la manera más respetuosa en el ejercicio del derecho consagrado en el Artículo 23 superior y desarrollado por la Ley 1755 de 2015, para presentar DERECHO DE PETICIÓN, con el ánimo de que me sean atendidas las siguientes </w:t>
+      </w:r>
     </w:p>
     <w:p>
       <w:pPr>
@@ -324,10 +332,12 @@
           <w:bCs/>
           <w:sz w:val="24"/>
           <w:szCs w:val="24"/>
-          <w:u w:val="single"/>
-        </w:rPr>
-      </w:pPr>
-      <w:r>
+        </w:rPr>
+      </w:pPr>
+    </w:p>
+    <w:p>
+      <w:pPr>
+        <w:jc w:val="center"/>
         <w:rPr>
           <w:rFonts w:ascii="Arial" w:hAnsi="Arial" w:cs="Arial"/>
           <w:b/>
@@ -336,6 +346,16 @@
           <w:szCs w:val="24"/>
           <w:u w:val="single"/>
         </w:rPr>
+      </w:pPr>
+      <w:r>
+        <w:rPr>
+          <w:rFonts w:ascii="Arial" w:hAnsi="Arial" w:cs="Arial"/>
+          <w:b/>
+          <w:bCs/>
+          <w:sz w:val="24"/>
+          <w:szCs w:val="24"/>
+          <w:u w:val="single"/>
+        </w:rPr>
         <w:t>PETICIONES</w:t>
       </w:r>
     </w:p>
@@ -359,6 +379,17 @@
         <w:t>Peticiones_Solicitud</w:t>
       </w:r>
       <w:proofErr w:type="spellEnd"/>
+    </w:p>
+    <w:p>
+      <w:pPr>
+        <w:spacing w:after="0"/>
+        <w:jc w:val="both"/>
+        <w:rPr>
+          <w:rFonts w:cs="Arial"/>
+          <w:sz w:val="24"/>
+          <w:szCs w:val="24"/>
+        </w:rPr>
+      </w:pPr>
       <w:r>
         <w:rPr>
           <w:rFonts w:cs="Arial"/>
@@ -452,13 +483,20 @@
     </w:p>
     <w:p>
       <w:pPr>
-        <w:jc w:val="both"/>
-        <w:rPr>
-          <w:rFonts w:ascii="Arial" w:hAnsi="Arial" w:cs="Arial"/>
-          <w:sz w:val="24"/>
-          <w:szCs w:val="24"/>
-        </w:rPr>
-      </w:pPr>
+        <w:rPr>
+          <w:rFonts w:ascii="Arial" w:hAnsi="Arial" w:cs="Arial"/>
+          <w:sz w:val="24"/>
+          <w:szCs w:val="24"/>
+        </w:rPr>
+      </w:pPr>
+      <w:r>
+        <w:rPr>
+          <w:rFonts w:ascii="Arial" w:hAnsi="Arial" w:cs="Arial"/>
+          <w:sz w:val="24"/>
+          <w:szCs w:val="24"/>
+        </w:rPr>
+        <w:br w:type="page"/>
+      </w:r>
     </w:p>
     <w:p>
       <w:pPr>
@@ -481,6 +519,7 @@
           <w:szCs w:val="24"/>
           <w:u w:val="single"/>
         </w:rPr>
+        <w:lastRenderedPageBreak/>
         <w:t>FUNDAMENTOS DE DERECHO</w:t>
       </w:r>
     </w:p>
@@ -631,7 +670,6 @@
           <w:sz w:val="24"/>
           <w:szCs w:val="24"/>
         </w:rPr>
-        <w:lastRenderedPageBreak/>
         <w:t xml:space="preserve">Ruego ser </w:t>
       </w:r>
       <w:proofErr w:type="spellStart"/>
@@ -910,6 +948,8 @@
     </w:p>
     <w:p/>
     <w:sectPr>
+      <w:headerReference w:type="default" r:id="rId7"/>
+      <w:footerReference w:type="default" r:id="rId8"/>
       <w:pgSz w:w="12240" w:h="15840"/>
       <w:pgMar w:top="1417" w:right="1701" w:bottom="1417" w:left="1701" w:header="708" w:footer="708" w:gutter="0"/>
       <w:cols w:space="708"/>
@@ -917,6 +957,205 @@
     </w:sectPr>
   </w:body>
 </w:document>
+</file>
+
+<file path=word/endnotes.xml><?xml version="1.0" encoding="utf-8"?>
+<w:endnotes xmlns:wpc="http://schemas.microsoft.com/office/word/2010/wordprocessingCanvas" xmlns:cx="http://schemas.microsoft.com/office/drawing/2014/chartex" xmlns:cx1="http://schemas.microsoft.com/office/drawing/2015/9/8/chartex" xmlns:cx2="http://schemas.microsoft.com/office/drawing/2015/10/21/chartex" xmlns:cx3="http://schemas.microsoft.com/office/drawing/2016/5/9/chartex" xmlns:cx4="http://schemas.microsoft.com/office/drawing/2016/5/10/chartex" xmlns:cx5="http://schemas.microsoft.com/office/drawing/2016/5/11/chartex" xmlns:cx6="http://schemas.microsoft.com/office/drawing/2016/5/12/chartex" xmlns:cx7="http://schemas.microsoft.com/office/drawing/2016/5/13/chartex" xmlns:cx8="http://schemas.microsoft.com/office/drawing/2016/5/14/chartex" xmlns:mc="http://schemas.openxmlformats.org/markup-compatibility/2006" xmlns:aink="http://schemas.microsoft.com/office/drawing/2016/ink" xmlns:am3d="http://schemas.microsoft.com/office/drawing/2017/model3d" xmlns:o="urn:schemas-microsoft-com:office:office" xmlns:oel="http://schemas.microsoft.com/office/2019/extlst" xmlns:r="http://schemas.openxmlformats.org/officeDocument/2006/relationships" xmlns:m="http://schemas.openxmlformats.org/officeDocument/2006/math" xmlns:v="urn:schemas-microsoft-com:vml" xmlns:wp14="http://schemas.microsoft.com/office/word/2010/wordprocessingDrawing" xmlns:wp="http://schemas.openxmlformats.org/drawingml/2006/wordprocessingDrawing" xmlns:w10="urn:schemas-microsoft-com:office:word" xmlns:w="http://schemas.openxmlformats.org/wordprocessingml/2006/main" xmlns:w14="http://schemas.microsoft.com/office/word/2010/wordml" xmlns:w15="http://schemas.microsoft.com/office/word/2012/wordml" xmlns:w16cex="http://schemas.microsoft.com/office/word/2018/wordml/cex" xmlns:w16cid="http://schemas.microsoft.com/office/word/2016/wordml/cid" xmlns:w16="http://schemas.microsoft.com/office/word/2018/wordml" xmlns:w16du="http://schemas.microsoft.com/office/word/2023/wordml/word16du" xmlns:w16sdtdh="http://schemas.microsoft.com/office/word/2020/wordml/sdtdatahash" xmlns:w16sdtfl="http://schemas.microsoft.com/office/word/2024/wordml/sdtformatlock" xmlns:w16se="http://schemas.microsoft.com/office/word/2015/wordml/symex" xmlns:wpg="http://schemas.microsoft.com/office/word/2010/wordprocessingGroup" xmlns:wpi="http://schemas.microsoft.com/office/word/2010/wordprocessingInk" xmlns:wne="http://schemas.microsoft.com/office/word/2006/wordml" xmlns:wps="http://schemas.microsoft.com/office/word/2010/wordprocessingShape" mc:Ignorable="w14 w15 w16se w16cid w16 w16cex w16sdtdh w16sdtfl w16du wp14">
+  <w:endnote w:type="separator" w:id="-1">
+    <w:p>
+      <w:pPr>
+        <w:spacing w:after="0" w:line="240" w:lineRule="auto"/>
+      </w:pPr>
+      <w:r>
+        <w:separator/>
+      </w:r>
+    </w:p>
+  </w:endnote>
+  <w:endnote w:type="continuationSeparator" w:id="0">
+    <w:p>
+      <w:pPr>
+        <w:spacing w:after="0" w:line="240" w:lineRule="auto"/>
+      </w:pPr>
+      <w:r>
+        <w:continuationSeparator/>
+      </w:r>
+    </w:p>
+  </w:endnote>
+</w:endnotes>
+</file>
+
+<file path=word/footer1.xml><?xml version="1.0" encoding="utf-8"?>
+<w:ftr xmlns:wpc="http://schemas.microsoft.com/office/word/2010/wordprocessingCanvas" xmlns:cx="http://schemas.microsoft.com/office/drawing/2014/chartex" xmlns:cx1="http://schemas.microsoft.com/office/drawing/2015/9/8/chartex" xmlns:cx2="http://schemas.microsoft.com/office/drawing/2015/10/21/chartex" xmlns:cx3="http://schemas.microsoft.com/office/drawing/2016/5/9/chartex" xmlns:cx4="http://schemas.microsoft.com/office/drawing/2016/5/10/chartex" xmlns:cx5="http://schemas.microsoft.com/office/drawing/2016/5/11/chartex" xmlns:cx6="http://schemas.microsoft.com/office/drawing/2016/5/12/chartex" xmlns:cx7="http://schemas.microsoft.com/office/drawing/2016/5/13/chartex" xmlns:cx8="http://schemas.microsoft.com/office/drawing/2016/5/14/chartex" xmlns:mc="http://schemas.openxmlformats.org/markup-compatibility/2006" xmlns:aink="http://schemas.microsoft.com/office/drawing/2016/ink" xmlns:am3d="http://schemas.microsoft.com/office/drawing/2017/model3d" xmlns:o="urn:schemas-microsoft-com:office:office" xmlns:oel="http://schemas.microsoft.com/office/2019/extlst" xmlns:r="http://schemas.openxmlformats.org/officeDocument/2006/relationships" xmlns:m="http://schemas.openxmlformats.org/officeDocument/2006/math" xmlns:v="urn:schemas-microsoft-com:vml" xmlns:wp14="http://schemas.microsoft.com/office/word/2010/wordprocessingDrawing" xmlns:wp="http://schemas.openxmlformats.org/drawingml/2006/wordprocessingDrawing" xmlns:w10="urn:schemas-microsoft-com:office:word" xmlns:w="http://schemas.openxmlformats.org/wordprocessingml/2006/main" xmlns:w14="http://schemas.microsoft.com/office/word/2010/wordml" xmlns:w15="http://schemas.microsoft.com/office/word/2012/wordml" xmlns:w16cex="http://schemas.microsoft.com/office/word/2018/wordml/cex" xmlns:w16cid="http://schemas.microsoft.com/office/word/2016/wordml/cid" xmlns:w16="http://schemas.microsoft.com/office/word/2018/wordml" xmlns:w16du="http://schemas.microsoft.com/office/word/2023/wordml/word16du" xmlns:w16sdtdh="http://schemas.microsoft.com/office/word/2020/wordml/sdtdatahash" xmlns:w16sdtfl="http://schemas.microsoft.com/office/word/2024/wordml/sdtformatlock" xmlns:w16se="http://schemas.microsoft.com/office/word/2015/wordml/symex" xmlns:wpg="http://schemas.microsoft.com/office/word/2010/wordprocessingGroup" xmlns:wpi="http://schemas.microsoft.com/office/word/2010/wordprocessingInk" xmlns:wne="http://schemas.microsoft.com/office/word/2006/wordml" xmlns:wps="http://schemas.microsoft.com/office/word/2010/wordprocessingShape" mc:Ignorable="w14 w15 w16se w16cid w16 w16cex w16sdtdh w16sdtfl w16du wp14">
+  <w:p>
+    <w:pPr>
+      <w:pStyle w:val="Piedepgina"/>
+      <w:jc w:val="center"/>
+      <w:rPr>
+        <w:color w:val="000000" w:themeColor="text1"/>
+      </w:rPr>
+    </w:pPr>
+    <w:r>
+      <w:rPr>
+        <w:color w:val="000000" w:themeColor="text1"/>
+        <w:lang w:val="es-ES"/>
+      </w:rPr>
+      <w:t xml:space="preserve">Página </w:t>
+    </w:r>
+    <w:r>
+      <w:rPr>
+        <w:color w:val="000000" w:themeColor="text1"/>
+      </w:rPr>
+      <w:fldChar w:fldCharType="begin"/>
+    </w:r>
+    <w:r>
+      <w:rPr>
+        <w:color w:val="000000" w:themeColor="text1"/>
+      </w:rPr>
+      <w:instrText>PAGE  \* Arabic  \* MERGEFORMAT</w:instrText>
+    </w:r>
+    <w:r>
+      <w:rPr>
+        <w:color w:val="000000" w:themeColor="text1"/>
+      </w:rPr>
+      <w:fldChar w:fldCharType="separate"/>
+    </w:r>
+    <w:r>
+      <w:rPr>
+        <w:color w:val="000000" w:themeColor="text1"/>
+        <w:lang w:val="es-ES"/>
+      </w:rPr>
+      <w:t>2</w:t>
+    </w:r>
+    <w:r>
+      <w:rPr>
+        <w:color w:val="000000" w:themeColor="text1"/>
+      </w:rPr>
+      <w:fldChar w:fldCharType="end"/>
+    </w:r>
+    <w:r>
+      <w:rPr>
+        <w:color w:val="000000" w:themeColor="text1"/>
+        <w:lang w:val="es-ES"/>
+      </w:rPr>
+      <w:t xml:space="preserve"> de </w:t>
+    </w:r>
+    <w:r>
+      <w:rPr>
+        <w:color w:val="000000" w:themeColor="text1"/>
+      </w:rPr>
+      <w:fldChar w:fldCharType="begin"/>
+    </w:r>
+    <w:r>
+      <w:rPr>
+        <w:color w:val="000000" w:themeColor="text1"/>
+      </w:rPr>
+      <w:instrText>NUMPAGES  \* Arabic  \* MERGEFORMAT</w:instrText>
+    </w:r>
+    <w:r>
+      <w:rPr>
+        <w:color w:val="000000" w:themeColor="text1"/>
+      </w:rPr>
+      <w:fldChar w:fldCharType="separate"/>
+    </w:r>
+    <w:r>
+      <w:rPr>
+        <w:color w:val="000000" w:themeColor="text1"/>
+        <w:lang w:val="es-ES"/>
+      </w:rPr>
+      <w:t>2</w:t>
+    </w:r>
+    <w:r>
+      <w:rPr>
+        <w:color w:val="000000" w:themeColor="text1"/>
+      </w:rPr>
+      <w:fldChar w:fldCharType="end"/>
+    </w:r>
+  </w:p>
+  <w:p>
+    <w:pPr>
+      <w:pStyle w:val="Piedepgina"/>
+    </w:pPr>
+  </w:p>
+</w:ftr>
+</file>
+
+<file path=word/footnotes.xml><?xml version="1.0" encoding="utf-8"?>
+<w:footnotes xmlns:wpc="http://schemas.microsoft.com/office/word/2010/wordprocessingCanvas" xmlns:cx="http://schemas.microsoft.com/office/drawing/2014/chartex" xmlns:cx1="http://schemas.microsoft.com/office/drawing/2015/9/8/chartex" xmlns:cx2="http://schemas.microsoft.com/office/drawing/2015/10/21/chartex" xmlns:cx3="http://schemas.microsoft.com/office/drawing/2016/5/9/chartex" xmlns:cx4="http://schemas.microsoft.com/office/drawing/2016/5/10/chartex" xmlns:cx5="http://schemas.microsoft.com/office/drawing/2016/5/11/chartex" xmlns:cx6="http://schemas.microsoft.com/office/drawing/2016/5/12/chartex" xmlns:cx7="http://schemas.microsoft.com/office/drawing/2016/5/13/chartex" xmlns:cx8="http://schemas.microsoft.com/office/drawing/2016/5/14/chartex" xmlns:mc="http://schemas.openxmlformats.org/markup-compatibility/2006" xmlns:aink="http://schemas.microsoft.com/office/drawing/2016/ink" xmlns:am3d="http://schemas.microsoft.com/office/drawing/2017/model3d" xmlns:o="urn:schemas-microsoft-com:office:office" xmlns:oel="http://schemas.microsoft.com/office/2019/extlst" xmlns:r="http://schemas.openxmlformats.org/officeDocument/2006/relationships" xmlns:m="http://schemas.openxmlformats.org/officeDocument/2006/math" xmlns:v="urn:schemas-microsoft-com:vml" xmlns:wp14="http://schemas.microsoft.com/office/word/2010/wordprocessingDrawing" xmlns:wp="http://schemas.openxmlformats.org/drawingml/2006/wordprocessingDrawing" xmlns:w10="urn:schemas-microsoft-com:office:word" xmlns:w="http://schemas.openxmlformats.org/wordprocessingml/2006/main" xmlns:w14="http://schemas.microsoft.com/office/word/2010/wordml" xmlns:w15="http://schemas.microsoft.com/office/word/2012/wordml" xmlns:w16cex="http://schemas.microsoft.com/office/word/2018/wordml/cex" xmlns:w16cid="http://schemas.microsoft.com/office/word/2016/wordml/cid" xmlns:w16="http://schemas.microsoft.com/office/word/2018/wordml" xmlns:w16du="http://schemas.microsoft.com/office/word/2023/wordml/word16du" xmlns:w16sdtdh="http://schemas.microsoft.com/office/word/2020/wordml/sdtdatahash" xmlns:w16sdtfl="http://schemas.microsoft.com/office/word/2024/wordml/sdtformatlock" xmlns:w16se="http://schemas.microsoft.com/office/word/2015/wordml/symex" xmlns:wpg="http://schemas.microsoft.com/office/word/2010/wordprocessingGroup" xmlns:wpi="http://schemas.microsoft.com/office/word/2010/wordprocessingInk" xmlns:wne="http://schemas.microsoft.com/office/word/2006/wordml" xmlns:wps="http://schemas.microsoft.com/office/word/2010/wordprocessingShape" mc:Ignorable="w14 w15 w16se w16cid w16 w16cex w16sdtdh w16sdtfl w16du wp14">
+  <w:footnote w:type="separator" w:id="-1">
+    <w:p>
+      <w:pPr>
+        <w:spacing w:after="0" w:line="240" w:lineRule="auto"/>
+      </w:pPr>
+      <w:r>
+        <w:separator/>
+      </w:r>
+    </w:p>
+  </w:footnote>
+  <w:footnote w:type="continuationSeparator" w:id="0">
+    <w:p>
+      <w:pPr>
+        <w:spacing w:after="0" w:line="240" w:lineRule="auto"/>
+      </w:pPr>
+      <w:r>
+        <w:continuationSeparator/>
+      </w:r>
+    </w:p>
+  </w:footnote>
+</w:footnotes>
+</file>
+
+<file path=word/header1.xml><?xml version="1.0" encoding="utf-8"?>
+<w:hdr xmlns:wpc="http://schemas.microsoft.com/office/word/2010/wordprocessingCanvas" xmlns:cx="http://schemas.microsoft.com/office/drawing/2014/chartex" xmlns:cx1="http://schemas.microsoft.com/office/drawing/2015/9/8/chartex" xmlns:cx2="http://schemas.microsoft.com/office/drawing/2015/10/21/chartex" xmlns:cx3="http://schemas.microsoft.com/office/drawing/2016/5/9/chartex" xmlns:cx4="http://schemas.microsoft.com/office/drawing/2016/5/10/chartex" xmlns:cx5="http://schemas.microsoft.com/office/drawing/2016/5/11/chartex" xmlns:cx6="http://schemas.microsoft.com/office/drawing/2016/5/12/chartex" xmlns:cx7="http://schemas.microsoft.com/office/drawing/2016/5/13/chartex" xmlns:cx8="http://schemas.microsoft.com/office/drawing/2016/5/14/chartex" xmlns:mc="http://schemas.openxmlformats.org/markup-compatibility/2006" xmlns:aink="http://schemas.microsoft.com/office/drawing/2016/ink" xmlns:am3d="http://schemas.microsoft.com/office/drawing/2017/model3d" xmlns:o="urn:schemas-microsoft-com:office:office" xmlns:oel="http://schemas.microsoft.com/office/2019/extlst" xmlns:r="http://schemas.openxmlformats.org/officeDocument/2006/relationships" xmlns:m="http://schemas.openxmlformats.org/officeDocument/2006/math" xmlns:v="urn:schemas-microsoft-com:vml" xmlns:wp14="http://schemas.microsoft.com/office/word/2010/wordprocessingDrawing" xmlns:wp="http://schemas.openxmlformats.org/drawingml/2006/wordprocessingDrawing" xmlns:w10="urn:schemas-microsoft-com:office:word" xmlns:w="http://schemas.openxmlformats.org/wordprocessingml/2006/main" xmlns:w14="http://schemas.microsoft.com/office/word/2010/wordml" xmlns:w15="http://schemas.microsoft.com/office/word/2012/wordml" xmlns:w16cex="http://schemas.microsoft.com/office/word/2018/wordml/cex" xmlns:w16cid="http://schemas.microsoft.com/office/word/2016/wordml/cid" xmlns:w16="http://schemas.microsoft.com/office/word/2018/wordml" xmlns:w16du="http://schemas.microsoft.com/office/word/2023/wordml/word16du" xmlns:w16sdtdh="http://schemas.microsoft.com/office/word/2020/wordml/sdtdatahash" xmlns:w16sdtfl="http://schemas.microsoft.com/office/word/2024/wordml/sdtformatlock" xmlns:w16se="http://schemas.microsoft.com/office/word/2015/wordml/symex" xmlns:wpg="http://schemas.microsoft.com/office/word/2010/wordprocessingGroup" xmlns:wpi="http://schemas.microsoft.com/office/word/2010/wordprocessingInk" xmlns:wne="http://schemas.microsoft.com/office/word/2006/wordml" xmlns:wps="http://schemas.microsoft.com/office/word/2010/wordprocessingShape" mc:Ignorable="w14 w15 w16se w16cid w16 w16cex w16sdtdh w16sdtfl w16du wp14">
+  <w:p>
+    <w:pPr>
+      <w:spacing w:after="0"/>
+      <w:jc w:val="right"/>
+      <w:rPr>
+        <w:rFonts w:ascii="Arial" w:hAnsi="Arial" w:cs="Arial"/>
+        <w:i/>
+        <w:iCs/>
+        <w:sz w:val="18"/>
+        <w:szCs w:val="18"/>
+      </w:rPr>
+    </w:pPr>
+    <w:r>
+      <w:rPr>
+        <w:rFonts w:ascii="Arial" w:hAnsi="Arial" w:cs="Arial"/>
+        <w:i/>
+        <w:iCs/>
+        <w:sz w:val="18"/>
+        <w:szCs w:val="18"/>
+      </w:rPr>
+      <w:t>Derecho de petición</w:t>
+    </w:r>
+    <w:r>
+      <w:rPr>
+        <w:rFonts w:ascii="Arial" w:hAnsi="Arial" w:cs="Arial"/>
+        <w:i/>
+        <w:iCs/>
+        <w:sz w:val="18"/>
+        <w:szCs w:val="18"/>
+      </w:rPr>
+      <w:t>, jueves, 30 de julio de 2026</w:t>
+    </w:r>
+    <w:r>
+      <w:rPr>
+        <w:rFonts w:ascii="Arial" w:hAnsi="Arial" w:cs="Arial"/>
+        <w:i/>
+        <w:iCs/>
+        <w:sz w:val="18"/>
+        <w:szCs w:val="18"/>
+      </w:rPr>
+      <w:t xml:space="preserve"> </w:t>
+    </w:r>
+  </w:p>
+  <w:p>
+    <w:pPr>
+      <w:pStyle w:val="Encabezado"/>
+      <w:jc w:val="right"/>
+    </w:pPr>
+  </w:p>
+</w:hdr>
 </file>
 
 <file path=word/numbering.xml><?xml version="1.0" encoding="utf-8"?>
@@ -1836,6 +2075,7 @@
   <w:style w:type="character" w:default="1" w:styleId="Fuentedeprrafopredeter">
     <w:name w:val="Default Paragraph Font"/>
     <w:uiPriority w:val="1"/>
+    <w:semiHidden/>
     <w:unhideWhenUsed/>
   </w:style>
   <w:style w:type="table" w:default="1" w:styleId="Tablanormal">
@@ -2170,6 +2410,58 @@
     <w:rPr>
       <w:color w:val="605E5C"/>
       <w:shd w:val="clear" w:color="auto" w:fill="E1DFDD"/>
+    </w:rPr>
+  </w:style>
+  <w:style w:type="paragraph" w:styleId="Encabezado">
+    <w:name w:val="header"/>
+    <w:basedOn w:val="Normal"/>
+    <w:link w:val="EncabezadoCar"/>
+    <w:uiPriority w:val="99"/>
+    <w:unhideWhenUsed/>
+    <w:rsid w:val="0040213D"/>
+    <w:pPr>
+      <w:tabs>
+        <w:tab w:val="center" w:pos="4419"/>
+        <w:tab w:val="right" w:pos="8838"/>
+      </w:tabs>
+      <w:spacing w:after="0" w:line="240" w:lineRule="auto"/>
+    </w:pPr>
+  </w:style>
+  <w:style w:type="character" w:customStyle="1" w:styleId="EncabezadoCar">
+    <w:name w:val="Encabezado Car"/>
+    <w:basedOn w:val="Fuentedeprrafopredeter"/>
+    <w:link w:val="Encabezado"/>
+    <w:uiPriority w:val="99"/>
+    <w:rsid w:val="0040213D"/>
+    <w:rPr>
+      <w:kern w:val="0"/>
+      <w14:ligatures w14:val="none"/>
+    </w:rPr>
+  </w:style>
+  <w:style w:type="paragraph" w:styleId="Piedepgina">
+    <w:name w:val="footer"/>
+    <w:basedOn w:val="Normal"/>
+    <w:link w:val="PiedepginaCar"/>
+    <w:uiPriority w:val="99"/>
+    <w:unhideWhenUsed/>
+    <w:rsid w:val="0040213D"/>
+    <w:pPr>
+      <w:tabs>
+        <w:tab w:val="center" w:pos="4419"/>
+        <w:tab w:val="right" w:pos="8838"/>
+      </w:tabs>
+      <w:spacing w:after="0" w:line="240" w:lineRule="auto"/>
+    </w:pPr>
+  </w:style>
+  <w:style w:type="character" w:customStyle="1" w:styleId="PiedepginaCar">
+    <w:name w:val="Pie de página Car"/>
+    <w:basedOn w:val="Fuentedeprrafopredeter"/>
+    <w:link w:val="Piedepgina"/>
+    <w:uiPriority w:val="99"/>
+    <w:rsid w:val="0040213D"/>
+    <w:rPr>
+      <w:kern w:val="0"/>
+      <w14:ligatures w14:val="none"/>
     </w:rPr>
   </w:style>
 </w:styles>

</xml_diff>

<commit_message>
- Se inicia el proceso de migración de info sensible al Backend - Se corrige para la solicitud de expedición duplicidad en la solicitud de direcciones. - Se mejora la composicion visual del apartado "Anexos" en el formulario recurso de reconsideracion - Se corrigen formatos y funciones que hacian que los documentos se llenaran parcialmente. - Se inicia la correccion de codigo interno y aplicacion de buenas practicas - Se inicia la simplificacion de funciones con react-query
</commit_message>
<xml_diff>
--- a/src/docs/Solicitud_Revision.docx
+++ b/src/docs/Solicitud_Revision.docx
@@ -1,6 +1,6 @@
 
 <file path=word/document.xml><?xml version="1.0" encoding="utf-8"?>
-<w:document xmlns:wpc="http://schemas.microsoft.com/office/word/2010/wordprocessingCanvas" xmlns:cx="http://schemas.microsoft.com/office/drawing/2014/chartex" xmlns:cx1="http://schemas.microsoft.com/office/drawing/2015/9/8/chartex" xmlns:cx2="http://schemas.microsoft.com/office/drawing/2015/10/21/chartex" xmlns:cx3="http://schemas.microsoft.com/office/drawing/2016/5/9/chartex" xmlns:cx4="http://schemas.microsoft.com/office/drawing/2016/5/10/chartex" xmlns:cx5="http://schemas.microsoft.com/office/drawing/2016/5/11/chartex" xmlns:cx6="http://schemas.microsoft.com/office/drawing/2016/5/12/chartex" xmlns:cx7="http://schemas.microsoft.com/office/drawing/2016/5/13/chartex" xmlns:cx8="http://schemas.microsoft.com/office/drawing/2016/5/14/chartex" xmlns:mc="http://schemas.openxmlformats.org/markup-compatibility/2006" xmlns:aink="http://schemas.microsoft.com/office/drawing/2016/ink" xmlns:am3d="http://schemas.microsoft.com/office/drawing/2017/model3d" xmlns:o="urn:schemas-microsoft-com:office:office" xmlns:oel="http://schemas.microsoft.com/office/2019/extlst" xmlns:r="http://schemas.openxmlformats.org/officeDocument/2006/relationships" xmlns:m="http://schemas.openxmlformats.org/officeDocument/2006/math" xmlns:v="urn:schemas-microsoft-com:vml" xmlns:wp14="http://schemas.microsoft.com/office/word/2010/wordprocessingDrawing" xmlns:wp="http://schemas.openxmlformats.org/drawingml/2006/wordprocessingDrawing" xmlns:w10="urn:schemas-microsoft-com:office:word" xmlns:w="http://schemas.openxmlformats.org/wordprocessingml/2006/main" xmlns:w14="http://schemas.microsoft.com/office/word/2010/wordml" xmlns:w15="http://schemas.microsoft.com/office/word/2012/wordml" xmlns:w16cex="http://schemas.microsoft.com/office/word/2018/wordml/cex" xmlns:w16cid="http://schemas.microsoft.com/office/word/2016/wordml/cid" xmlns:w16="http://schemas.microsoft.com/office/word/2018/wordml" xmlns:w16du="http://schemas.microsoft.com/office/word/2023/wordml/word16du" xmlns:w16sdtdh="http://schemas.microsoft.com/office/word/2020/wordml/sdtdatahash" xmlns:w16sdtfl="http://schemas.microsoft.com/office/word/2024/wordml/sdtformatlock" xmlns:w16se="http://schemas.microsoft.com/office/word/2015/wordml/symex" xmlns:wpg="http://schemas.microsoft.com/office/word/2010/wordprocessingGroup" xmlns:wpi="http://schemas.microsoft.com/office/word/2010/wordprocessingInk" xmlns:wne="http://schemas.microsoft.com/office/word/2006/wordml" xmlns:wps="http://schemas.microsoft.com/office/word/2010/wordprocessingShape" mc:Ignorable="w14 w15 w16se w16cid w16 w16cex w16sdtdh w16sdtfl w16du wp14">
+<w:document xmlns:wpc="http://schemas.microsoft.com/office/word/2010/wordprocessingCanvas" xmlns:cx="http://schemas.microsoft.com/office/drawing/2014/chartex" xmlns:cx1="http://schemas.microsoft.com/office/drawing/2015/9/8/chartex" xmlns:cx2="http://schemas.microsoft.com/office/drawing/2015/10/21/chartex" xmlns:cx3="http://schemas.microsoft.com/office/drawing/2016/5/9/chartex" xmlns:cx4="http://schemas.microsoft.com/office/drawing/2016/5/10/chartex" xmlns:cx5="http://schemas.microsoft.com/office/drawing/2016/5/11/chartex" xmlns:cx6="http://schemas.microsoft.com/office/drawing/2016/5/12/chartex" xmlns:cx7="http://schemas.microsoft.com/office/drawing/2016/5/13/chartex" xmlns:cx8="http://schemas.microsoft.com/office/drawing/2016/5/14/chartex" xmlns:mc="http://schemas.openxmlformats.org/markup-compatibility/2006" xmlns:aink="http://schemas.microsoft.com/office/drawing/2016/ink" xmlns:am3d="http://schemas.microsoft.com/office/drawing/2017/model3d" xmlns:o="urn:schemas-microsoft-com:office:office" xmlns:oel="http://schemas.microsoft.com/office/2019/extlst" xmlns:r="http://schemas.openxmlformats.org/officeDocument/2006/relationships" xmlns:m="http://schemas.openxmlformats.org/officeDocument/2006/math" xmlns:v="urn:schemas-microsoft-com:vml" xmlns:wp14="http://schemas.microsoft.com/office/word/2010/wordprocessingDrawing" xmlns:wp="http://schemas.openxmlformats.org/drawingml/2006/wordprocessingDrawing" xmlns:w10="urn:schemas-microsoft-com:office:word" xmlns:w="http://schemas.openxmlformats.org/wordprocessingml/2006/main" xmlns:w14="http://schemas.microsoft.com/office/word/2010/wordml" xmlns:w15="http://schemas.microsoft.com/office/word/2012/wordml" xmlns:w16cei="http://schemas.microsoft.com/office/word/2026/wordml/cei" xmlns:w16cex="http://schemas.microsoft.com/office/word/2018/wordml/cex" xmlns:w16cid="http://schemas.microsoft.com/office/word/2016/wordml/cid" xmlns:w16="http://schemas.microsoft.com/office/word/2018/wordml" xmlns:w16du="http://schemas.microsoft.com/office/word/2023/wordml/word16du" xmlns:w16sdtdh="http://schemas.microsoft.com/office/word/2020/wordml/sdtdatahash" xmlns:w16sdtfl="http://schemas.microsoft.com/office/word/2024/wordml/sdtformatlock" xmlns:w16se="http://schemas.microsoft.com/office/word/2015/wordml/symex" xmlns:wpg="http://schemas.microsoft.com/office/word/2010/wordprocessingGroup" xmlns:wpi="http://schemas.microsoft.com/office/word/2010/wordprocessingInk" xmlns:wne="http://schemas.microsoft.com/office/word/2006/wordml" xmlns:wps="http://schemas.microsoft.com/office/word/2010/wordprocessingShape" mc:Ignorable="w14 w15 w16se w16cid w16 w16cex w16sdtdh w16sdtfl w16du wp14">
   <w:body>
     <w:p>
       <w:pPr>
@@ -186,6 +186,7 @@
           <w:rFonts w:ascii="Arial" w:hAnsi="Arial" w:cs="Arial"/>
           <w:sz w:val="24"/>
           <w:szCs w:val="24"/>
+          <w:u w:val="single"/>
         </w:rPr>
       </w:pPr>
       <w:r>
@@ -199,6 +200,7 @@
     </w:p>
     <w:p>
       <w:pPr>
+        <w:spacing w:after="0"/>
         <w:jc w:val="both"/>
         <w:rPr>
           <w:rFonts w:ascii="Arial" w:hAnsi="Arial" w:cs="Arial"/>
@@ -215,18 +217,7 @@
           <w:sz w:val="24"/>
           <w:szCs w:val="24"/>
         </w:rPr>
-        <w:t>Nombre_</w:t>
-      </w:r>
-      <w:proofErr w:type="gramStart"/>
-      <w:r>
-        <w:rPr>
-          <w:rFonts w:ascii="Arial" w:hAnsi="Arial" w:cs="Arial"/>
-          <w:b/>
-          <w:bCs/>
-          <w:sz w:val="24"/>
-          <w:szCs w:val="24"/>
-        </w:rPr>
-        <w:t>Solicitante</w:t>
+        <w:t>Nombre_Solicitante</w:t>
       </w:r>
       <w:proofErr w:type="spellEnd"/>
       <w:r>
@@ -235,6 +226,14 @@
           <w:sz w:val="24"/>
           <w:szCs w:val="24"/>
         </w:rPr>
+        <w:t>,</w:t>
+      </w:r>
+      <w:r>
+        <w:rPr>
+          <w:rFonts w:ascii="Arial" w:hAnsi="Arial" w:cs="Arial"/>
+          <w:sz w:val="24"/>
+          <w:szCs w:val="24"/>
+        </w:rPr>
         <w:t xml:space="preserve"> </w:t>
       </w:r>
       <w:r>
@@ -243,24 +242,7 @@
           <w:sz w:val="24"/>
           <w:szCs w:val="24"/>
         </w:rPr>
-        <w:t>,</w:t>
-      </w:r>
-      <w:r>
-        <w:rPr>
-          <w:rFonts w:ascii="Arial" w:hAnsi="Arial" w:cs="Arial"/>
-          <w:sz w:val="24"/>
-          <w:szCs w:val="24"/>
-        </w:rPr>
-        <w:t>mayor</w:t>
-      </w:r>
-      <w:proofErr w:type="gramEnd"/>
-      <w:r>
-        <w:rPr>
-          <w:rFonts w:ascii="Arial" w:hAnsi="Arial" w:cs="Arial"/>
-          <w:sz w:val="24"/>
-          <w:szCs w:val="24"/>
-        </w:rPr>
-        <w:t xml:space="preserve"> de edad, </w:t>
+        <w:t xml:space="preserve">mayor de edad, </w:t>
       </w:r>
       <w:proofErr w:type="spellStart"/>
       <w:r>
@@ -706,6 +688,19 @@
         </w:rPr>
         <w:t xml:space="preserve">de su respuesta en las siguientes direcciones: </w:t>
       </w:r>
+    </w:p>
+    <w:p>
+      <w:pPr>
+        <w:spacing w:after="0"/>
+        <w:jc w:val="both"/>
+        <w:rPr>
+          <w:rFonts w:ascii="Arial" w:hAnsi="Arial" w:cs="Arial"/>
+          <w:b/>
+          <w:bCs/>
+          <w:sz w:val="24"/>
+          <w:szCs w:val="24"/>
+        </w:rPr>
+      </w:pPr>
     </w:p>
     <w:p>
       <w:pPr>
@@ -960,7 +955,7 @@
 </file>
 
 <file path=word/endnotes.xml><?xml version="1.0" encoding="utf-8"?>
-<w:endnotes xmlns:wpc="http://schemas.microsoft.com/office/word/2010/wordprocessingCanvas" xmlns:cx="http://schemas.microsoft.com/office/drawing/2014/chartex" xmlns:cx1="http://schemas.microsoft.com/office/drawing/2015/9/8/chartex" xmlns:cx2="http://schemas.microsoft.com/office/drawing/2015/10/21/chartex" xmlns:cx3="http://schemas.microsoft.com/office/drawing/2016/5/9/chartex" xmlns:cx4="http://schemas.microsoft.com/office/drawing/2016/5/10/chartex" xmlns:cx5="http://schemas.microsoft.com/office/drawing/2016/5/11/chartex" xmlns:cx6="http://schemas.microsoft.com/office/drawing/2016/5/12/chartex" xmlns:cx7="http://schemas.microsoft.com/office/drawing/2016/5/13/chartex" xmlns:cx8="http://schemas.microsoft.com/office/drawing/2016/5/14/chartex" xmlns:mc="http://schemas.openxmlformats.org/markup-compatibility/2006" xmlns:aink="http://schemas.microsoft.com/office/drawing/2016/ink" xmlns:am3d="http://schemas.microsoft.com/office/drawing/2017/model3d" xmlns:o="urn:schemas-microsoft-com:office:office" xmlns:oel="http://schemas.microsoft.com/office/2019/extlst" xmlns:r="http://schemas.openxmlformats.org/officeDocument/2006/relationships" xmlns:m="http://schemas.openxmlformats.org/officeDocument/2006/math" xmlns:v="urn:schemas-microsoft-com:vml" xmlns:wp14="http://schemas.microsoft.com/office/word/2010/wordprocessingDrawing" xmlns:wp="http://schemas.openxmlformats.org/drawingml/2006/wordprocessingDrawing" xmlns:w10="urn:schemas-microsoft-com:office:word" xmlns:w="http://schemas.openxmlformats.org/wordprocessingml/2006/main" xmlns:w14="http://schemas.microsoft.com/office/word/2010/wordml" xmlns:w15="http://schemas.microsoft.com/office/word/2012/wordml" xmlns:w16cex="http://schemas.microsoft.com/office/word/2018/wordml/cex" xmlns:w16cid="http://schemas.microsoft.com/office/word/2016/wordml/cid" xmlns:w16="http://schemas.microsoft.com/office/word/2018/wordml" xmlns:w16du="http://schemas.microsoft.com/office/word/2023/wordml/word16du" xmlns:w16sdtdh="http://schemas.microsoft.com/office/word/2020/wordml/sdtdatahash" xmlns:w16sdtfl="http://schemas.microsoft.com/office/word/2024/wordml/sdtformatlock" xmlns:w16se="http://schemas.microsoft.com/office/word/2015/wordml/symex" xmlns:wpg="http://schemas.microsoft.com/office/word/2010/wordprocessingGroup" xmlns:wpi="http://schemas.microsoft.com/office/word/2010/wordprocessingInk" xmlns:wne="http://schemas.microsoft.com/office/word/2006/wordml" xmlns:wps="http://schemas.microsoft.com/office/word/2010/wordprocessingShape" mc:Ignorable="w14 w15 w16se w16cid w16 w16cex w16sdtdh w16sdtfl w16du wp14">
+<w:endnotes xmlns:wpc="http://schemas.microsoft.com/office/word/2010/wordprocessingCanvas" xmlns:cx="http://schemas.microsoft.com/office/drawing/2014/chartex" xmlns:cx1="http://schemas.microsoft.com/office/drawing/2015/9/8/chartex" xmlns:cx2="http://schemas.microsoft.com/office/drawing/2015/10/21/chartex" xmlns:cx3="http://schemas.microsoft.com/office/drawing/2016/5/9/chartex" xmlns:cx4="http://schemas.microsoft.com/office/drawing/2016/5/10/chartex" xmlns:cx5="http://schemas.microsoft.com/office/drawing/2016/5/11/chartex" xmlns:cx6="http://schemas.microsoft.com/office/drawing/2016/5/12/chartex" xmlns:cx7="http://schemas.microsoft.com/office/drawing/2016/5/13/chartex" xmlns:cx8="http://schemas.microsoft.com/office/drawing/2016/5/14/chartex" xmlns:mc="http://schemas.openxmlformats.org/markup-compatibility/2006" xmlns:aink="http://schemas.microsoft.com/office/drawing/2016/ink" xmlns:am3d="http://schemas.microsoft.com/office/drawing/2017/model3d" xmlns:o="urn:schemas-microsoft-com:office:office" xmlns:oel="http://schemas.microsoft.com/office/2019/extlst" xmlns:r="http://schemas.openxmlformats.org/officeDocument/2006/relationships" xmlns:m="http://schemas.openxmlformats.org/officeDocument/2006/math" xmlns:v="urn:schemas-microsoft-com:vml" xmlns:wp14="http://schemas.microsoft.com/office/word/2010/wordprocessingDrawing" xmlns:wp="http://schemas.openxmlformats.org/drawingml/2006/wordprocessingDrawing" xmlns:w10="urn:schemas-microsoft-com:office:word" xmlns:w="http://schemas.openxmlformats.org/wordprocessingml/2006/main" xmlns:w14="http://schemas.microsoft.com/office/word/2010/wordml" xmlns:w15="http://schemas.microsoft.com/office/word/2012/wordml" xmlns:w16cei="http://schemas.microsoft.com/office/word/2026/wordml/cei" xmlns:w16cex="http://schemas.microsoft.com/office/word/2018/wordml/cex" xmlns:w16cid="http://schemas.microsoft.com/office/word/2016/wordml/cid" xmlns:w16="http://schemas.microsoft.com/office/word/2018/wordml" xmlns:w16du="http://schemas.microsoft.com/office/word/2023/wordml/word16du" xmlns:w16sdtdh="http://schemas.microsoft.com/office/word/2020/wordml/sdtdatahash" xmlns:w16sdtfl="http://schemas.microsoft.com/office/word/2024/wordml/sdtformatlock" xmlns:w16se="http://schemas.microsoft.com/office/word/2015/wordml/symex" xmlns:wpg="http://schemas.microsoft.com/office/word/2010/wordprocessingGroup" xmlns:wpi="http://schemas.microsoft.com/office/word/2010/wordprocessingInk" xmlns:wne="http://schemas.microsoft.com/office/word/2006/wordml" xmlns:wps="http://schemas.microsoft.com/office/word/2010/wordprocessingShape" mc:Ignorable="w14 w15 w16se w16cid w16 w16cex w16sdtdh w16sdtfl w16du wp14">
   <w:endnote w:type="separator" w:id="-1">
     <w:p>
       <w:pPr>
@@ -985,7 +980,7 @@
 </file>
 
 <file path=word/footer1.xml><?xml version="1.0" encoding="utf-8"?>
-<w:ftr xmlns:wpc="http://schemas.microsoft.com/office/word/2010/wordprocessingCanvas" xmlns:cx="http://schemas.microsoft.com/office/drawing/2014/chartex" xmlns:cx1="http://schemas.microsoft.com/office/drawing/2015/9/8/chartex" xmlns:cx2="http://schemas.microsoft.com/office/drawing/2015/10/21/chartex" xmlns:cx3="http://schemas.microsoft.com/office/drawing/2016/5/9/chartex" xmlns:cx4="http://schemas.microsoft.com/office/drawing/2016/5/10/chartex" xmlns:cx5="http://schemas.microsoft.com/office/drawing/2016/5/11/chartex" xmlns:cx6="http://schemas.microsoft.com/office/drawing/2016/5/12/chartex" xmlns:cx7="http://schemas.microsoft.com/office/drawing/2016/5/13/chartex" xmlns:cx8="http://schemas.microsoft.com/office/drawing/2016/5/14/chartex" xmlns:mc="http://schemas.openxmlformats.org/markup-compatibility/2006" xmlns:aink="http://schemas.microsoft.com/office/drawing/2016/ink" xmlns:am3d="http://schemas.microsoft.com/office/drawing/2017/model3d" xmlns:o="urn:schemas-microsoft-com:office:office" xmlns:oel="http://schemas.microsoft.com/office/2019/extlst" xmlns:r="http://schemas.openxmlformats.org/officeDocument/2006/relationships" xmlns:m="http://schemas.openxmlformats.org/officeDocument/2006/math" xmlns:v="urn:schemas-microsoft-com:vml" xmlns:wp14="http://schemas.microsoft.com/office/word/2010/wordprocessingDrawing" xmlns:wp="http://schemas.openxmlformats.org/drawingml/2006/wordprocessingDrawing" xmlns:w10="urn:schemas-microsoft-com:office:word" xmlns:w="http://schemas.openxmlformats.org/wordprocessingml/2006/main" xmlns:w14="http://schemas.microsoft.com/office/word/2010/wordml" xmlns:w15="http://schemas.microsoft.com/office/word/2012/wordml" xmlns:w16cex="http://schemas.microsoft.com/office/word/2018/wordml/cex" xmlns:w16cid="http://schemas.microsoft.com/office/word/2016/wordml/cid" xmlns:w16="http://schemas.microsoft.com/office/word/2018/wordml" xmlns:w16du="http://schemas.microsoft.com/office/word/2023/wordml/word16du" xmlns:w16sdtdh="http://schemas.microsoft.com/office/word/2020/wordml/sdtdatahash" xmlns:w16sdtfl="http://schemas.microsoft.com/office/word/2024/wordml/sdtformatlock" xmlns:w16se="http://schemas.microsoft.com/office/word/2015/wordml/symex" xmlns:wpg="http://schemas.microsoft.com/office/word/2010/wordprocessingGroup" xmlns:wpi="http://schemas.microsoft.com/office/word/2010/wordprocessingInk" xmlns:wne="http://schemas.microsoft.com/office/word/2006/wordml" xmlns:wps="http://schemas.microsoft.com/office/word/2010/wordprocessingShape" mc:Ignorable="w14 w15 w16se w16cid w16 w16cex w16sdtdh w16sdtfl w16du wp14">
+<w:ftr xmlns:wpc="http://schemas.microsoft.com/office/word/2010/wordprocessingCanvas" xmlns:cx="http://schemas.microsoft.com/office/drawing/2014/chartex" xmlns:cx1="http://schemas.microsoft.com/office/drawing/2015/9/8/chartex" xmlns:cx2="http://schemas.microsoft.com/office/drawing/2015/10/21/chartex" xmlns:cx3="http://schemas.microsoft.com/office/drawing/2016/5/9/chartex" xmlns:cx4="http://schemas.microsoft.com/office/drawing/2016/5/10/chartex" xmlns:cx5="http://schemas.microsoft.com/office/drawing/2016/5/11/chartex" xmlns:cx6="http://schemas.microsoft.com/office/drawing/2016/5/12/chartex" xmlns:cx7="http://schemas.microsoft.com/office/drawing/2016/5/13/chartex" xmlns:cx8="http://schemas.microsoft.com/office/drawing/2016/5/14/chartex" xmlns:mc="http://schemas.openxmlformats.org/markup-compatibility/2006" xmlns:aink="http://schemas.microsoft.com/office/drawing/2016/ink" xmlns:am3d="http://schemas.microsoft.com/office/drawing/2017/model3d" xmlns:o="urn:schemas-microsoft-com:office:office" xmlns:oel="http://schemas.microsoft.com/office/2019/extlst" xmlns:r="http://schemas.openxmlformats.org/officeDocument/2006/relationships" xmlns:m="http://schemas.openxmlformats.org/officeDocument/2006/math" xmlns:v="urn:schemas-microsoft-com:vml" xmlns:wp14="http://schemas.microsoft.com/office/word/2010/wordprocessingDrawing" xmlns:wp="http://schemas.openxmlformats.org/drawingml/2006/wordprocessingDrawing" xmlns:w10="urn:schemas-microsoft-com:office:word" xmlns:w="http://schemas.openxmlformats.org/wordprocessingml/2006/main" xmlns:w14="http://schemas.microsoft.com/office/word/2010/wordml" xmlns:w15="http://schemas.microsoft.com/office/word/2012/wordml" xmlns:w16cei="http://schemas.microsoft.com/office/word/2026/wordml/cei" xmlns:w16cex="http://schemas.microsoft.com/office/word/2018/wordml/cex" xmlns:w16cid="http://schemas.microsoft.com/office/word/2016/wordml/cid" xmlns:w16="http://schemas.microsoft.com/office/word/2018/wordml" xmlns:w16du="http://schemas.microsoft.com/office/word/2023/wordml/word16du" xmlns:w16sdtdh="http://schemas.microsoft.com/office/word/2020/wordml/sdtdatahash" xmlns:w16sdtfl="http://schemas.microsoft.com/office/word/2024/wordml/sdtformatlock" xmlns:w16se="http://schemas.microsoft.com/office/word/2015/wordml/symex" xmlns:wpg="http://schemas.microsoft.com/office/word/2010/wordprocessingGroup" xmlns:wpi="http://schemas.microsoft.com/office/word/2010/wordprocessingInk" xmlns:wne="http://schemas.microsoft.com/office/word/2006/wordml" xmlns:wps="http://schemas.microsoft.com/office/word/2010/wordprocessingShape" mc:Ignorable="w14 w15 w16se w16cid w16 w16cex w16sdtdh w16sdtfl w16du wp14">
   <w:p>
     <w:pPr>
       <w:pStyle w:val="Piedepgina"/>
@@ -1080,7 +1075,7 @@
 </file>
 
 <file path=word/footnotes.xml><?xml version="1.0" encoding="utf-8"?>
-<w:footnotes xmlns:wpc="http://schemas.microsoft.com/office/word/2010/wordprocessingCanvas" xmlns:cx="http://schemas.microsoft.com/office/drawing/2014/chartex" xmlns:cx1="http://schemas.microsoft.com/office/drawing/2015/9/8/chartex" xmlns:cx2="http://schemas.microsoft.com/office/drawing/2015/10/21/chartex" xmlns:cx3="http://schemas.microsoft.com/office/drawing/2016/5/9/chartex" xmlns:cx4="http://schemas.microsoft.com/office/drawing/2016/5/10/chartex" xmlns:cx5="http://schemas.microsoft.com/office/drawing/2016/5/11/chartex" xmlns:cx6="http://schemas.microsoft.com/office/drawing/2016/5/12/chartex" xmlns:cx7="http://schemas.microsoft.com/office/drawing/2016/5/13/chartex" xmlns:cx8="http://schemas.microsoft.com/office/drawing/2016/5/14/chartex" xmlns:mc="http://schemas.openxmlformats.org/markup-compatibility/2006" xmlns:aink="http://schemas.microsoft.com/office/drawing/2016/ink" xmlns:am3d="http://schemas.microsoft.com/office/drawing/2017/model3d" xmlns:o="urn:schemas-microsoft-com:office:office" xmlns:oel="http://schemas.microsoft.com/office/2019/extlst" xmlns:r="http://schemas.openxmlformats.org/officeDocument/2006/relationships" xmlns:m="http://schemas.openxmlformats.org/officeDocument/2006/math" xmlns:v="urn:schemas-microsoft-com:vml" xmlns:wp14="http://schemas.microsoft.com/office/word/2010/wordprocessingDrawing" xmlns:wp="http://schemas.openxmlformats.org/drawingml/2006/wordprocessingDrawing" xmlns:w10="urn:schemas-microsoft-com:office:word" xmlns:w="http://schemas.openxmlformats.org/wordprocessingml/2006/main" xmlns:w14="http://schemas.microsoft.com/office/word/2010/wordml" xmlns:w15="http://schemas.microsoft.com/office/word/2012/wordml" xmlns:w16cex="http://schemas.microsoft.com/office/word/2018/wordml/cex" xmlns:w16cid="http://schemas.microsoft.com/office/word/2016/wordml/cid" xmlns:w16="http://schemas.microsoft.com/office/word/2018/wordml" xmlns:w16du="http://schemas.microsoft.com/office/word/2023/wordml/word16du" xmlns:w16sdtdh="http://schemas.microsoft.com/office/word/2020/wordml/sdtdatahash" xmlns:w16sdtfl="http://schemas.microsoft.com/office/word/2024/wordml/sdtformatlock" xmlns:w16se="http://schemas.microsoft.com/office/word/2015/wordml/symex" xmlns:wpg="http://schemas.microsoft.com/office/word/2010/wordprocessingGroup" xmlns:wpi="http://schemas.microsoft.com/office/word/2010/wordprocessingInk" xmlns:wne="http://schemas.microsoft.com/office/word/2006/wordml" xmlns:wps="http://schemas.microsoft.com/office/word/2010/wordprocessingShape" mc:Ignorable="w14 w15 w16se w16cid w16 w16cex w16sdtdh w16sdtfl w16du wp14">
+<w:footnotes xmlns:wpc="http://schemas.microsoft.com/office/word/2010/wordprocessingCanvas" xmlns:cx="http://schemas.microsoft.com/office/drawing/2014/chartex" xmlns:cx1="http://schemas.microsoft.com/office/drawing/2015/9/8/chartex" xmlns:cx2="http://schemas.microsoft.com/office/drawing/2015/10/21/chartex" xmlns:cx3="http://schemas.microsoft.com/office/drawing/2016/5/9/chartex" xmlns:cx4="http://schemas.microsoft.com/office/drawing/2016/5/10/chartex" xmlns:cx5="http://schemas.microsoft.com/office/drawing/2016/5/11/chartex" xmlns:cx6="http://schemas.microsoft.com/office/drawing/2016/5/12/chartex" xmlns:cx7="http://schemas.microsoft.com/office/drawing/2016/5/13/chartex" xmlns:cx8="http://schemas.microsoft.com/office/drawing/2016/5/14/chartex" xmlns:mc="http://schemas.openxmlformats.org/markup-compatibility/2006" xmlns:aink="http://schemas.microsoft.com/office/drawing/2016/ink" xmlns:am3d="http://schemas.microsoft.com/office/drawing/2017/model3d" xmlns:o="urn:schemas-microsoft-com:office:office" xmlns:oel="http://schemas.microsoft.com/office/2019/extlst" xmlns:r="http://schemas.openxmlformats.org/officeDocument/2006/relationships" xmlns:m="http://schemas.openxmlformats.org/officeDocument/2006/math" xmlns:v="urn:schemas-microsoft-com:vml" xmlns:wp14="http://schemas.microsoft.com/office/word/2010/wordprocessingDrawing" xmlns:wp="http://schemas.openxmlformats.org/drawingml/2006/wordprocessingDrawing" xmlns:w10="urn:schemas-microsoft-com:office:word" xmlns:w="http://schemas.openxmlformats.org/wordprocessingml/2006/main" xmlns:w14="http://schemas.microsoft.com/office/word/2010/wordml" xmlns:w15="http://schemas.microsoft.com/office/word/2012/wordml" xmlns:w16cei="http://schemas.microsoft.com/office/word/2026/wordml/cei" xmlns:w16cex="http://schemas.microsoft.com/office/word/2018/wordml/cex" xmlns:w16cid="http://schemas.microsoft.com/office/word/2016/wordml/cid" xmlns:w16="http://schemas.microsoft.com/office/word/2018/wordml" xmlns:w16du="http://schemas.microsoft.com/office/word/2023/wordml/word16du" xmlns:w16sdtdh="http://schemas.microsoft.com/office/word/2020/wordml/sdtdatahash" xmlns:w16sdtfl="http://schemas.microsoft.com/office/word/2024/wordml/sdtformatlock" xmlns:w16se="http://schemas.microsoft.com/office/word/2015/wordml/symex" xmlns:wpg="http://schemas.microsoft.com/office/word/2010/wordprocessingGroup" xmlns:wpi="http://schemas.microsoft.com/office/word/2010/wordprocessingInk" xmlns:wne="http://schemas.microsoft.com/office/word/2006/wordml" xmlns:wps="http://schemas.microsoft.com/office/word/2010/wordprocessingShape" mc:Ignorable="w14 w15 w16se w16cid w16 w16cex w16sdtdh w16sdtfl w16du wp14">
   <w:footnote w:type="separator" w:id="-1">
     <w:p>
       <w:pPr>
@@ -1105,7 +1100,7 @@
 </file>
 
 <file path=word/header1.xml><?xml version="1.0" encoding="utf-8"?>
-<w:hdr xmlns:wpc="http://schemas.microsoft.com/office/word/2010/wordprocessingCanvas" xmlns:cx="http://schemas.microsoft.com/office/drawing/2014/chartex" xmlns:cx1="http://schemas.microsoft.com/office/drawing/2015/9/8/chartex" xmlns:cx2="http://schemas.microsoft.com/office/drawing/2015/10/21/chartex" xmlns:cx3="http://schemas.microsoft.com/office/drawing/2016/5/9/chartex" xmlns:cx4="http://schemas.microsoft.com/office/drawing/2016/5/10/chartex" xmlns:cx5="http://schemas.microsoft.com/office/drawing/2016/5/11/chartex" xmlns:cx6="http://schemas.microsoft.com/office/drawing/2016/5/12/chartex" xmlns:cx7="http://schemas.microsoft.com/office/drawing/2016/5/13/chartex" xmlns:cx8="http://schemas.microsoft.com/office/drawing/2016/5/14/chartex" xmlns:mc="http://schemas.openxmlformats.org/markup-compatibility/2006" xmlns:aink="http://schemas.microsoft.com/office/drawing/2016/ink" xmlns:am3d="http://schemas.microsoft.com/office/drawing/2017/model3d" xmlns:o="urn:schemas-microsoft-com:office:office" xmlns:oel="http://schemas.microsoft.com/office/2019/extlst" xmlns:r="http://schemas.openxmlformats.org/officeDocument/2006/relationships" xmlns:m="http://schemas.openxmlformats.org/officeDocument/2006/math" xmlns:v="urn:schemas-microsoft-com:vml" xmlns:wp14="http://schemas.microsoft.com/office/word/2010/wordprocessingDrawing" xmlns:wp="http://schemas.openxmlformats.org/drawingml/2006/wordprocessingDrawing" xmlns:w10="urn:schemas-microsoft-com:office:word" xmlns:w="http://schemas.openxmlformats.org/wordprocessingml/2006/main" xmlns:w14="http://schemas.microsoft.com/office/word/2010/wordml" xmlns:w15="http://schemas.microsoft.com/office/word/2012/wordml" xmlns:w16cex="http://schemas.microsoft.com/office/word/2018/wordml/cex" xmlns:w16cid="http://schemas.microsoft.com/office/word/2016/wordml/cid" xmlns:w16="http://schemas.microsoft.com/office/word/2018/wordml" xmlns:w16du="http://schemas.microsoft.com/office/word/2023/wordml/word16du" xmlns:w16sdtdh="http://schemas.microsoft.com/office/word/2020/wordml/sdtdatahash" xmlns:w16sdtfl="http://schemas.microsoft.com/office/word/2024/wordml/sdtformatlock" xmlns:w16se="http://schemas.microsoft.com/office/word/2015/wordml/symex" xmlns:wpg="http://schemas.microsoft.com/office/word/2010/wordprocessingGroup" xmlns:wpi="http://schemas.microsoft.com/office/word/2010/wordprocessingInk" xmlns:wne="http://schemas.microsoft.com/office/word/2006/wordml" xmlns:wps="http://schemas.microsoft.com/office/word/2010/wordprocessingShape" mc:Ignorable="w14 w15 w16se w16cid w16 w16cex w16sdtdh w16sdtfl w16du wp14">
+<w:hdr xmlns:wpc="http://schemas.microsoft.com/office/word/2010/wordprocessingCanvas" xmlns:cx="http://schemas.microsoft.com/office/drawing/2014/chartex" xmlns:cx1="http://schemas.microsoft.com/office/drawing/2015/9/8/chartex" xmlns:cx2="http://schemas.microsoft.com/office/drawing/2015/10/21/chartex" xmlns:cx3="http://schemas.microsoft.com/office/drawing/2016/5/9/chartex" xmlns:cx4="http://schemas.microsoft.com/office/drawing/2016/5/10/chartex" xmlns:cx5="http://schemas.microsoft.com/office/drawing/2016/5/11/chartex" xmlns:cx6="http://schemas.microsoft.com/office/drawing/2016/5/12/chartex" xmlns:cx7="http://schemas.microsoft.com/office/drawing/2016/5/13/chartex" xmlns:cx8="http://schemas.microsoft.com/office/drawing/2016/5/14/chartex" xmlns:mc="http://schemas.openxmlformats.org/markup-compatibility/2006" xmlns:aink="http://schemas.microsoft.com/office/drawing/2016/ink" xmlns:am3d="http://schemas.microsoft.com/office/drawing/2017/model3d" xmlns:o="urn:schemas-microsoft-com:office:office" xmlns:oel="http://schemas.microsoft.com/office/2019/extlst" xmlns:r="http://schemas.openxmlformats.org/officeDocument/2006/relationships" xmlns:m="http://schemas.openxmlformats.org/officeDocument/2006/math" xmlns:v="urn:schemas-microsoft-com:vml" xmlns:wp14="http://schemas.microsoft.com/office/word/2010/wordprocessingDrawing" xmlns:wp="http://schemas.openxmlformats.org/drawingml/2006/wordprocessingDrawing" xmlns:w10="urn:schemas-microsoft-com:office:word" xmlns:w="http://schemas.openxmlformats.org/wordprocessingml/2006/main" xmlns:w14="http://schemas.microsoft.com/office/word/2010/wordml" xmlns:w15="http://schemas.microsoft.com/office/word/2012/wordml" xmlns:w16cei="http://schemas.microsoft.com/office/word/2026/wordml/cei" xmlns:w16cex="http://schemas.microsoft.com/office/word/2018/wordml/cex" xmlns:w16cid="http://schemas.microsoft.com/office/word/2016/wordml/cid" xmlns:w16="http://schemas.microsoft.com/office/word/2018/wordml" xmlns:w16du="http://schemas.microsoft.com/office/word/2023/wordml/word16du" xmlns:w16sdtdh="http://schemas.microsoft.com/office/word/2020/wordml/sdtdatahash" xmlns:w16sdtfl="http://schemas.microsoft.com/office/word/2024/wordml/sdtformatlock" xmlns:w16se="http://schemas.microsoft.com/office/word/2015/wordml/symex" xmlns:wpg="http://schemas.microsoft.com/office/word/2010/wordprocessingGroup" xmlns:wpi="http://schemas.microsoft.com/office/word/2010/wordprocessingInk" xmlns:wne="http://schemas.microsoft.com/office/word/2006/wordml" xmlns:wps="http://schemas.microsoft.com/office/word/2010/wordprocessingShape" mc:Ignorable="w14 w15 w16se w16cid w16 w16cex w16sdtdh w16sdtfl w16du wp14">
   <w:p>
     <w:pPr>
       <w:spacing w:after="0"/>
@@ -1126,27 +1121,7 @@
         <w:sz w:val="18"/>
         <w:szCs w:val="18"/>
       </w:rPr>
-      <w:t>Derecho de petición</w:t>
-    </w:r>
-    <w:r>
-      <w:rPr>
-        <w:rFonts w:ascii="Arial" w:hAnsi="Arial" w:cs="Arial"/>
-        <w:i/>
-        <w:iCs/>
-        <w:sz w:val="18"/>
-        <w:szCs w:val="18"/>
-      </w:rPr>
-      <w:t>, jueves, 30 de julio de 2026</w:t>
-    </w:r>
-    <w:r>
-      <w:rPr>
-        <w:rFonts w:ascii="Arial" w:hAnsi="Arial" w:cs="Arial"/>
-        <w:i/>
-        <w:iCs/>
-        <w:sz w:val="18"/>
-        <w:szCs w:val="18"/>
-      </w:rPr>
-      <w:t xml:space="preserve"> </w:t>
+      <w:t xml:space="preserve">Derecho de petición, jueves, 30 de julio de 2026 </w:t>
     </w:r>
   </w:p>
   <w:p>
@@ -1159,7 +1134,7 @@
 </file>
 
 <file path=word/numbering.xml><?xml version="1.0" encoding="utf-8"?>
-<w:numbering xmlns:wpc="http://schemas.microsoft.com/office/word/2010/wordprocessingCanvas" xmlns:cx="http://schemas.microsoft.com/office/drawing/2014/chartex" xmlns:cx1="http://schemas.microsoft.com/office/drawing/2015/9/8/chartex" xmlns:cx2="http://schemas.microsoft.com/office/drawing/2015/10/21/chartex" xmlns:cx3="http://schemas.microsoft.com/office/drawing/2016/5/9/chartex" xmlns:cx4="http://schemas.microsoft.com/office/drawing/2016/5/10/chartex" xmlns:cx5="http://schemas.microsoft.com/office/drawing/2016/5/11/chartex" xmlns:cx6="http://schemas.microsoft.com/office/drawing/2016/5/12/chartex" xmlns:cx7="http://schemas.microsoft.com/office/drawing/2016/5/13/chartex" xmlns:cx8="http://schemas.microsoft.com/office/drawing/2016/5/14/chartex" xmlns:mc="http://schemas.openxmlformats.org/markup-compatibility/2006" xmlns:aink="http://schemas.microsoft.com/office/drawing/2016/ink" xmlns:am3d="http://schemas.microsoft.com/office/drawing/2017/model3d" xmlns:o="urn:schemas-microsoft-com:office:office" xmlns:oel="http://schemas.microsoft.com/office/2019/extlst" xmlns:r="http://schemas.openxmlformats.org/officeDocument/2006/relationships" xmlns:m="http://schemas.openxmlformats.org/officeDocument/2006/math" xmlns:v="urn:schemas-microsoft-com:vml" xmlns:wp14="http://schemas.microsoft.com/office/word/2010/wordprocessingDrawing" xmlns:wp="http://schemas.openxmlformats.org/drawingml/2006/wordprocessingDrawing" xmlns:w10="urn:schemas-microsoft-com:office:word" xmlns:w="http://schemas.openxmlformats.org/wordprocessingml/2006/main" xmlns:w14="http://schemas.microsoft.com/office/word/2010/wordml" xmlns:w15="http://schemas.microsoft.com/office/word/2012/wordml" xmlns:w16cex="http://schemas.microsoft.com/office/word/2018/wordml/cex" xmlns:w16cid="http://schemas.microsoft.com/office/word/2016/wordml/cid" xmlns:w16="http://schemas.microsoft.com/office/word/2018/wordml" xmlns:w16du="http://schemas.microsoft.com/office/word/2023/wordml/word16du" xmlns:w16sdtdh="http://schemas.microsoft.com/office/word/2020/wordml/sdtdatahash" xmlns:w16sdtfl="http://schemas.microsoft.com/office/word/2024/wordml/sdtformatlock" xmlns:w16se="http://schemas.microsoft.com/office/word/2015/wordml/symex" xmlns:wpg="http://schemas.microsoft.com/office/word/2010/wordprocessingGroup" xmlns:wpi="http://schemas.microsoft.com/office/word/2010/wordprocessingInk" xmlns:wne="http://schemas.microsoft.com/office/word/2006/wordml" xmlns:wps="http://schemas.microsoft.com/office/word/2010/wordprocessingShape" mc:Ignorable="w14 w15 w16se w16cid w16 w16cex w16sdtdh w16sdtfl w16du wp14">
+<w:numbering xmlns:wpc="http://schemas.microsoft.com/office/word/2010/wordprocessingCanvas" xmlns:cx="http://schemas.microsoft.com/office/drawing/2014/chartex" xmlns:cx1="http://schemas.microsoft.com/office/drawing/2015/9/8/chartex" xmlns:cx2="http://schemas.microsoft.com/office/drawing/2015/10/21/chartex" xmlns:cx3="http://schemas.microsoft.com/office/drawing/2016/5/9/chartex" xmlns:cx4="http://schemas.microsoft.com/office/drawing/2016/5/10/chartex" xmlns:cx5="http://schemas.microsoft.com/office/drawing/2016/5/11/chartex" xmlns:cx6="http://schemas.microsoft.com/office/drawing/2016/5/12/chartex" xmlns:cx7="http://schemas.microsoft.com/office/drawing/2016/5/13/chartex" xmlns:cx8="http://schemas.microsoft.com/office/drawing/2016/5/14/chartex" xmlns:mc="http://schemas.openxmlformats.org/markup-compatibility/2006" xmlns:aink="http://schemas.microsoft.com/office/drawing/2016/ink" xmlns:am3d="http://schemas.microsoft.com/office/drawing/2017/model3d" xmlns:o="urn:schemas-microsoft-com:office:office" xmlns:oel="http://schemas.microsoft.com/office/2019/extlst" xmlns:r="http://schemas.openxmlformats.org/officeDocument/2006/relationships" xmlns:m="http://schemas.openxmlformats.org/officeDocument/2006/math" xmlns:v="urn:schemas-microsoft-com:vml" xmlns:wp14="http://schemas.microsoft.com/office/word/2010/wordprocessingDrawing" xmlns:wp="http://schemas.openxmlformats.org/drawingml/2006/wordprocessingDrawing" xmlns:w10="urn:schemas-microsoft-com:office:word" xmlns:w="http://schemas.openxmlformats.org/wordprocessingml/2006/main" xmlns:w14="http://schemas.microsoft.com/office/word/2010/wordml" xmlns:w15="http://schemas.microsoft.com/office/word/2012/wordml" xmlns:w16cei="http://schemas.microsoft.com/office/word/2026/wordml/cei" xmlns:w16cex="http://schemas.microsoft.com/office/word/2018/wordml/cex" xmlns:w16cid="http://schemas.microsoft.com/office/word/2016/wordml/cid" xmlns:w16="http://schemas.microsoft.com/office/word/2018/wordml" xmlns:w16du="http://schemas.microsoft.com/office/word/2023/wordml/word16du" xmlns:w16sdtdh="http://schemas.microsoft.com/office/word/2020/wordml/sdtdatahash" xmlns:w16sdtfl="http://schemas.microsoft.com/office/word/2024/wordml/sdtformatlock" xmlns:w16se="http://schemas.microsoft.com/office/word/2015/wordml/symex" xmlns:wpg="http://schemas.microsoft.com/office/word/2010/wordprocessingGroup" xmlns:wpi="http://schemas.microsoft.com/office/word/2010/wordprocessingInk" xmlns:wne="http://schemas.microsoft.com/office/word/2006/wordml" xmlns:wps="http://schemas.microsoft.com/office/word/2010/wordprocessingShape" mc:Ignorable="w14 w15 w16se w16cid w16 w16cex w16sdtdh w16sdtfl w16du wp14">
   <w:abstractNum w:abstractNumId="0" w15:restartNumberingAfterBreak="0">
     <w:nsid w:val="2D08466B"/>
     <w:multiLevelType w:val="hybridMultilevel"/>

</xml_diff>